<commit_message>
feat(frontend): UI 全面优化 + 交付物更新
交互增强：
- 任务栏/控件栏可折叠：悬停栏右边缘中部浮出半透明半圆按钮（«/»）
- 画布节点拖到垃圾桶删除：拖动时浮现、悬停放大变红、松手碎裂坠落动画

UI 优化：
- 画布节点卡片化（色条+类别图标+投影），连线平滑曲线+流动动画
- 登录页品牌区+slogan+特性列表，深色渐变背景
- 监控页指标渐变卡片（吞吐/累计行数/采样时间）
- 全局主题 token（主色 #2f54eb、圆角 8px）、中文语言包
- 表格斑马纹+悬停高亮、页面标题区统一（图标徽章+副标题）
- 暗色模式（Header 切换，localStorage 持久化，画布/表格全适配）
- 空状态 SVG 插画 + 引导文案
- ErrorBoundary 渲染兜底

交付物：
- 新增演示视频.mp4、测试报告更名《完整测试报告.docx》、概要设计更新
- README 交付物清单同步
- gitignore 排除前端 tsbuildinfo
</commit_message>
<xml_diff>
--- a/deliverables/概要设计说明书.docx
+++ b/deliverables/概要设计说明书.docx
@@ -32,7 +32,6 @@
               <w:tab w:val="right" w:leader="dot" w:pos="8630"/>
             </w:tabs>
             <w:rPr>
-              <w:rFonts w:hint="eastAsia"/>
               <w:noProof/>
             </w:rPr>
           </w:pPr>
@@ -146,7 +145,6 @@
             </w:tabs>
             <w:ind w:left="480"/>
             <w:rPr>
-              <w:rFonts w:hint="eastAsia"/>
               <w:noProof/>
             </w:rPr>
           </w:pPr>
@@ -244,7 +242,6 @@
             </w:tabs>
             <w:ind w:left="480"/>
             <w:rPr>
-              <w:rFonts w:hint="eastAsia"/>
               <w:noProof/>
             </w:rPr>
           </w:pPr>
@@ -342,7 +339,6 @@
             </w:tabs>
             <w:ind w:left="480"/>
             <w:rPr>
-              <w:rFonts w:hint="eastAsia"/>
               <w:noProof/>
             </w:rPr>
           </w:pPr>
@@ -440,7 +436,6 @@
             </w:tabs>
             <w:ind w:left="480"/>
             <w:rPr>
-              <w:rFonts w:hint="eastAsia"/>
               <w:noProof/>
             </w:rPr>
           </w:pPr>
@@ -538,7 +533,6 @@
             </w:tabs>
             <w:ind w:left="480"/>
             <w:rPr>
-              <w:rFonts w:hint="eastAsia"/>
               <w:noProof/>
             </w:rPr>
           </w:pPr>
@@ -643,7 +637,6 @@
             </w:tabs>
             <w:ind w:left="480"/>
             <w:rPr>
-              <w:rFonts w:hint="eastAsia"/>
               <w:noProof/>
             </w:rPr>
           </w:pPr>
@@ -741,7 +734,6 @@
             </w:tabs>
             <w:ind w:left="480"/>
             <w:rPr>
-              <w:rFonts w:hint="eastAsia"/>
               <w:noProof/>
             </w:rPr>
           </w:pPr>
@@ -839,7 +831,6 @@
             </w:tabs>
             <w:ind w:left="480"/>
             <w:rPr>
-              <w:rFonts w:hint="eastAsia"/>
               <w:noProof/>
             </w:rPr>
           </w:pPr>
@@ -965,7 +956,6 @@
             </w:tabs>
             <w:ind w:left="480"/>
             <w:rPr>
-              <w:rFonts w:hint="eastAsia"/>
               <w:noProof/>
             </w:rPr>
           </w:pPr>
@@ -1063,7 +1053,6 @@
             </w:tabs>
             <w:ind w:left="480"/>
             <w:rPr>
-              <w:rFonts w:hint="eastAsia"/>
               <w:noProof/>
             </w:rPr>
           </w:pPr>
@@ -1161,7 +1150,6 @@
             </w:tabs>
             <w:ind w:left="480"/>
             <w:rPr>
-              <w:rFonts w:hint="eastAsia"/>
               <w:noProof/>
             </w:rPr>
           </w:pPr>
@@ -1262,8 +1250,8 @@
       <w:pPr>
         <w:pStyle w:val="1"/>
       </w:pPr>
-      <w:bookmarkStart w:id="0" w:name="通用流处理任务管理平台-概要设计"/>
-      <w:bookmarkStart w:id="1" w:name="_Toc238503869"/>
+      <w:bookmarkStart w:id="0" w:name="_Toc238503869"/>
+      <w:bookmarkStart w:id="1" w:name="通用流处理任务管理平台-概要设计"/>
       <w:r>
         <w:rPr>
           <w:rFonts w:hint="eastAsia"/>
@@ -1279,7 +1267,7 @@
         </w:rPr>
         <w:t>概要设计</w:t>
       </w:r>
-      <w:bookmarkEnd w:id="1"/>
+      <w:bookmarkEnd w:id="0"/>
     </w:p>
     <w:p>
       <w:pPr>
@@ -1323,8 +1311,8 @@
       <w:pPr>
         <w:pStyle w:val="2"/>
       </w:pPr>
-      <w:bookmarkStart w:id="2" w:name="项目概述"/>
-      <w:bookmarkStart w:id="3" w:name="_Toc238503870"/>
+      <w:bookmarkStart w:id="2" w:name="_Toc238503870"/>
+      <w:bookmarkStart w:id="3" w:name="项目概述"/>
       <w:r>
         <w:t xml:space="preserve">1. </w:t>
       </w:r>
@@ -1334,7 +1322,7 @@
         </w:rPr>
         <w:t>项目概述</w:t>
       </w:r>
-      <w:bookmarkEnd w:id="3"/>
+      <w:bookmarkEnd w:id="2"/>
     </w:p>
     <w:p>
       <w:pPr>
@@ -2164,9 +2152,9 @@
       <w:pPr>
         <w:pStyle w:val="2"/>
       </w:pPr>
-      <w:bookmarkStart w:id="6" w:name="总体架构"/>
-      <w:bookmarkStart w:id="7" w:name="_Toc238503871"/>
-      <w:bookmarkEnd w:id="2"/>
+      <w:bookmarkStart w:id="6" w:name="_Toc238503871"/>
+      <w:bookmarkStart w:id="7" w:name="总体架构"/>
+      <w:bookmarkEnd w:id="3"/>
       <w:bookmarkEnd w:id="5"/>
       <w:r>
         <w:t xml:space="preserve">2. </w:t>
@@ -2177,7 +2165,7 @@
         </w:rPr>
         <w:t>总体架构</w:t>
       </w:r>
-      <w:bookmarkEnd w:id="7"/>
+      <w:bookmarkEnd w:id="6"/>
     </w:p>
     <w:p>
       <w:pPr>
@@ -3234,9 +3222,9 @@
       <w:pPr>
         <w:pStyle w:val="2"/>
       </w:pPr>
-      <w:bookmarkStart w:id="8" w:name="技术选型"/>
-      <w:bookmarkStart w:id="9" w:name="_Toc238503872"/>
-      <w:bookmarkEnd w:id="6"/>
+      <w:bookmarkStart w:id="8" w:name="_Toc238503872"/>
+      <w:bookmarkStart w:id="9" w:name="技术选型"/>
+      <w:bookmarkEnd w:id="7"/>
       <w:r>
         <w:t xml:space="preserve">3. </w:t>
       </w:r>
@@ -3246,7 +3234,7 @@
         </w:rPr>
         <w:t>技术选型</w:t>
       </w:r>
-      <w:bookmarkEnd w:id="9"/>
+      <w:bookmarkEnd w:id="8"/>
     </w:p>
     <w:tbl>
       <w:tblPr>
@@ -3596,12 +3584,14 @@
               </w:rPr>
               <w:t>（</w:t>
             </w:r>
+            <w:proofErr w:type="spellStart"/>
             <w:r>
               <w:rPr>
                 <w:rFonts w:hint="eastAsia"/>
               </w:rPr>
               <w:t>KafkaClient</w:t>
             </w:r>
+            <w:proofErr w:type="spellEnd"/>
             <w:r>
               <w:t xml:space="preserve"> </w:t>
             </w:r>
@@ -3625,7 +3615,7 @@
               <w:rPr>
                 <w:rFonts w:hint="eastAsia"/>
               </w:rPr>
-              <w:t>题目要求；分区机制天然支持</w:t>
+              <w:t>分区机制天然支持</w:t>
             </w:r>
             <w:r>
               <w:t xml:space="preserve"> Worker </w:t>
@@ -3714,7 +3704,7 @@
               <w:rPr>
                 <w:rFonts w:hint="eastAsia"/>
               </w:rPr>
-              <w:t>挑战项：字段补数控件</w:t>
+              <w:t>字段补数控件</w:t>
             </w:r>
             <w:r>
               <w:t xml:space="preserve"> + Worker </w:t>
@@ -3847,12 +3837,6 @@
               <w:rPr>
                 <w:rFonts w:hint="eastAsia"/>
               </w:rPr>
-              <w:t>挑战项，</w:t>
-            </w:r>
-            <w:r>
-              <w:rPr>
-                <w:rFonts w:hint="eastAsia"/>
-              </w:rPr>
               <w:t>Java</w:t>
             </w:r>
             <w:r>
@@ -3914,12 +3898,6 @@
             <w:pPr>
               <w:pStyle w:val="Compact"/>
             </w:pPr>
-            <w:r>
-              <w:rPr>
-                <w:rFonts w:hint="eastAsia"/>
-              </w:rPr>
-              <w:t>挑战项</w:t>
-            </w:r>
           </w:p>
         </w:tc>
       </w:tr>
@@ -3979,12 +3957,14 @@
               </w:rPr>
               <w:t>拖拽库；</w:t>
             </w:r>
+            <w:proofErr w:type="spellStart"/>
             <w:r>
               <w:rPr>
                 <w:rFonts w:hint="eastAsia"/>
               </w:rPr>
               <w:t>AntD</w:t>
             </w:r>
+            <w:proofErr w:type="spellEnd"/>
             <w:r>
               <w:t xml:space="preserve"> </w:t>
             </w:r>
@@ -4121,11 +4101,10 @@
       <w:pPr>
         <w:pStyle w:val="2"/>
       </w:pPr>
-      <w:bookmarkStart w:id="10" w:name="模块设计"/>
-      <w:bookmarkStart w:id="11" w:name="_Toc238503873"/>
-      <w:bookmarkEnd w:id="8"/>
-      <w:r>
-        <w:lastRenderedPageBreak/>
+      <w:bookmarkStart w:id="10" w:name="_Toc238503873"/>
+      <w:bookmarkStart w:id="11" w:name="模块设计"/>
+      <w:bookmarkEnd w:id="9"/>
+      <w:r>
         <w:t xml:space="preserve">4. </w:t>
       </w:r>
       <w:r>
@@ -4134,7 +4113,7 @@
         </w:rPr>
         <w:t>模块设计</w:t>
       </w:r>
-      <w:bookmarkEnd w:id="11"/>
+      <w:bookmarkEnd w:id="10"/>
     </w:p>
     <w:p>
       <w:pPr>
@@ -4217,14 +4196,17 @@
         <w:rPr>
           <w:rFonts w:hint="eastAsia"/>
         </w:rPr>
+        <w:lastRenderedPageBreak/>
         <w:t>表：</w:t>
       </w:r>
+      <w:proofErr w:type="spellStart"/>
       <w:r>
         <w:rPr>
           <w:rStyle w:val="VerbatimChar"/>
         </w:rPr>
         <w:t>sys_user</w:t>
       </w:r>
+      <w:proofErr w:type="spellEnd"/>
       <w:r>
         <w:t>。</w:t>
       </w:r>
@@ -5018,12 +5000,14 @@
       <w:r>
         <w:t xml:space="preserve"> </w:t>
       </w:r>
+      <w:proofErr w:type="spellStart"/>
       <w:r>
         <w:rPr>
           <w:rStyle w:val="VerbatimChar"/>
         </w:rPr>
         <w:t>job_instance</w:t>
       </w:r>
+      <w:proofErr w:type="spellEnd"/>
       <w:r>
         <w:rPr>
           <w:rFonts w:hint="eastAsia"/>
@@ -5117,7 +5101,6 @@
           <w:b/>
           <w:bCs/>
         </w:rPr>
-        <w:lastRenderedPageBreak/>
         <w:t>下线</w:t>
       </w:r>
       <w:r>
@@ -5240,6 +5223,7 @@
       <w:bookmarkStart w:id="16" w:name="监控与日志增强项服务演示"/>
       <w:bookmarkEnd w:id="15"/>
       <w:r>
+        <w:lastRenderedPageBreak/>
         <w:t xml:space="preserve">4.5 </w:t>
       </w:r>
       <w:r>
@@ -5349,9 +5333,9 @@
       <w:pPr>
         <w:pStyle w:val="2"/>
       </w:pPr>
-      <w:bookmarkStart w:id="17" w:name="执行引擎与控件-spi"/>
-      <w:bookmarkStart w:id="18" w:name="_Toc238503874"/>
-      <w:bookmarkEnd w:id="10"/>
+      <w:bookmarkStart w:id="17" w:name="_Toc238503874"/>
+      <w:bookmarkStart w:id="18" w:name="执行引擎与控件-spi"/>
+      <w:bookmarkEnd w:id="11"/>
       <w:bookmarkEnd w:id="16"/>
       <w:r>
         <w:t xml:space="preserve">5. </w:t>
@@ -5365,7 +5349,7 @@
       <w:r>
         <w:t xml:space="preserve"> SPI</w:t>
       </w:r>
-      <w:bookmarkEnd w:id="18"/>
+      <w:bookmarkEnd w:id="17"/>
     </w:p>
     <w:p>
       <w:pPr>
@@ -5573,7 +5557,21 @@
         <w:rPr>
           <w:rStyle w:val="NormalTok"/>
         </w:rPr>
-        <w:t xml:space="preserve"> AutoCloseable </w:t>
+        <w:t xml:space="preserve"> </w:t>
+      </w:r>
+      <w:proofErr w:type="spellStart"/>
+      <w:r>
+        <w:rPr>
+          <w:rStyle w:val="NormalTok"/>
+        </w:rPr>
+        <w:t>AutoCloseable</w:t>
+      </w:r>
+      <w:proofErr w:type="spellEnd"/>
+      <w:r>
+        <w:rPr>
+          <w:rStyle w:val="NormalTok"/>
+        </w:rPr>
+        <w:t xml:space="preserve"> </w:t>
       </w:r>
       <w:r>
         <w:rPr>
@@ -5626,6 +5624,7 @@
         </w:rPr>
         <w:t>&lt;</w:t>
       </w:r>
+      <w:proofErr w:type="spellStart"/>
       <w:r>
         <w:rPr>
           <w:rStyle w:val="BuiltInTok"/>
@@ -5644,6 +5643,7 @@
         </w:rPr>
         <w:t>Object</w:t>
       </w:r>
+      <w:proofErr w:type="spellEnd"/>
       <w:r>
         <w:rPr>
           <w:rStyle w:val="OperatorTok"/>
@@ -5678,8 +5678,16 @@
         <w:rPr>
           <w:rStyle w:val="NormalTok"/>
         </w:rPr>
-        <w:t xml:space="preserve"> ctx</w:t>
-      </w:r>
+        <w:t xml:space="preserve"> </w:t>
+      </w:r>
+      <w:proofErr w:type="spellStart"/>
+      <w:r>
+        <w:rPr>
+          <w:rStyle w:val="NormalTok"/>
+        </w:rPr>
+        <w:t>ctx</w:t>
+      </w:r>
+      <w:proofErr w:type="spellEnd"/>
       <w:r>
         <w:rPr>
           <w:rStyle w:val="OperatorTok"/>
@@ -5908,6 +5916,7 @@
         </w:rPr>
         <w:t>&lt;</w:t>
       </w:r>
+      <w:proofErr w:type="spellStart"/>
       <w:r>
         <w:rPr>
           <w:rStyle w:val="BuiltInTok"/>
@@ -5926,6 +5935,7 @@
         </w:rPr>
         <w:t>Object</w:t>
       </w:r>
+      <w:proofErr w:type="spellEnd"/>
       <w:r>
         <w:rPr>
           <w:rStyle w:val="OperatorTok"/>
@@ -5960,8 +5970,16 @@
         <w:rPr>
           <w:rStyle w:val="NormalTok"/>
         </w:rPr>
-        <w:t xml:space="preserve"> ctx</w:t>
-      </w:r>
+        <w:t xml:space="preserve"> </w:t>
+      </w:r>
+      <w:proofErr w:type="spellStart"/>
+      <w:r>
+        <w:rPr>
+          <w:rStyle w:val="NormalTok"/>
+        </w:rPr>
+        <w:t>ctx</w:t>
+      </w:r>
+      <w:proofErr w:type="spellEnd"/>
       <w:r>
         <w:rPr>
           <w:rStyle w:val="OperatorTok"/>
@@ -6134,7 +6152,21 @@
         <w:rPr>
           <w:rStyle w:val="NormalTok"/>
         </w:rPr>
-        <w:t xml:space="preserve"> AutoCloseable </w:t>
+        <w:t xml:space="preserve"> </w:t>
+      </w:r>
+      <w:proofErr w:type="spellStart"/>
+      <w:r>
+        <w:rPr>
+          <w:rStyle w:val="NormalTok"/>
+        </w:rPr>
+        <w:t>AutoCloseable</w:t>
+      </w:r>
+      <w:proofErr w:type="spellEnd"/>
+      <w:r>
+        <w:rPr>
+          <w:rStyle w:val="NormalTok"/>
+        </w:rPr>
+        <w:t xml:space="preserve"> </w:t>
       </w:r>
       <w:r>
         <w:rPr>
@@ -6187,6 +6219,7 @@
         </w:rPr>
         <w:t>&lt;</w:t>
       </w:r>
+      <w:proofErr w:type="spellStart"/>
       <w:r>
         <w:rPr>
           <w:rStyle w:val="BuiltInTok"/>
@@ -6205,6 +6238,7 @@
         </w:rPr>
         <w:t>Object</w:t>
       </w:r>
+      <w:proofErr w:type="spellEnd"/>
       <w:r>
         <w:rPr>
           <w:rStyle w:val="OperatorTok"/>
@@ -6239,8 +6273,16 @@
         <w:rPr>
           <w:rStyle w:val="NormalTok"/>
         </w:rPr>
-        <w:t xml:space="preserve"> ctx</w:t>
-      </w:r>
+        <w:t xml:space="preserve"> </w:t>
+      </w:r>
+      <w:proofErr w:type="spellStart"/>
+      <w:r>
+        <w:rPr>
+          <w:rStyle w:val="NormalTok"/>
+        </w:rPr>
+        <w:t>ctx</w:t>
+      </w:r>
+      <w:proofErr w:type="spellEnd"/>
       <w:r>
         <w:rPr>
           <w:rStyle w:val="OperatorTok"/>
@@ -6415,7 +6457,15 @@
           <w:rStyle w:val="VerbatimChar"/>
           <w:rFonts w:hint="eastAsia"/>
         </w:rPr>
-        <w:t>Q1(</w:t>
+        <w:t>Q1</w:t>
+      </w:r>
+      <w:proofErr w:type="gramStart"/>
+      <w:r>
+        <w:rPr>
+          <w:rStyle w:val="VerbatimChar"/>
+          <w:rFonts w:hint="eastAsia"/>
+        </w:rPr>
+        <w:t>(</w:t>
       </w:r>
       <w:r>
         <w:rPr>
@@ -6429,7 +6479,15 @@
           <w:rStyle w:val="VerbatimChar"/>
           <w:rFonts w:hint="eastAsia"/>
         </w:rPr>
-        <w:t>)]</w:t>
+        <w:t>)</w:t>
+      </w:r>
+      <w:proofErr w:type="gramEnd"/>
+      <w:r>
+        <w:rPr>
+          <w:rStyle w:val="VerbatimChar"/>
+          <w:rFonts w:hint="eastAsia"/>
+        </w:rPr>
+        <w:t>]</w:t>
       </w:r>
       <w:r>
         <w:rPr>
@@ -6444,6 +6502,7 @@
         </w:rPr>
         <w:t>处理线程</w:t>
       </w:r>
+      <w:proofErr w:type="gramStart"/>
       <w:r>
         <w:rPr>
           <w:rStyle w:val="VerbatimChar"/>
@@ -6465,6 +6524,7 @@
         </w:rPr>
         <w:t>)</w:t>
       </w:r>
+      <w:proofErr w:type="gramEnd"/>
       <w:r>
         <w:rPr>
           <w:rStyle w:val="VerbatimChar"/>
@@ -6490,7 +6550,15 @@
           <w:rStyle w:val="VerbatimChar"/>
           <w:rFonts w:hint="eastAsia"/>
         </w:rPr>
-        <w:t>Q2(</w:t>
+        <w:t>Q2</w:t>
+      </w:r>
+      <w:proofErr w:type="gramStart"/>
+      <w:r>
+        <w:rPr>
+          <w:rStyle w:val="VerbatimChar"/>
+          <w:rFonts w:hint="eastAsia"/>
+        </w:rPr>
+        <w:t>(</w:t>
       </w:r>
       <w:r>
         <w:rPr>
@@ -6504,7 +6572,15 @@
           <w:rStyle w:val="VerbatimChar"/>
           <w:rFonts w:hint="eastAsia"/>
         </w:rPr>
-        <w:t>)]</w:t>
+        <w:t>)</w:t>
+      </w:r>
+      <w:proofErr w:type="gramEnd"/>
+      <w:r>
+        <w:rPr>
+          <w:rStyle w:val="VerbatimChar"/>
+          <w:rFonts w:hint="eastAsia"/>
+        </w:rPr>
+        <w:t>]</w:t>
       </w:r>
       <w:r>
         <w:rPr>
@@ -6562,6 +6638,7 @@
         </w:rPr>
         <w:t xml:space="preserve">   </w:t>
       </w:r>
+      <w:proofErr w:type="gramStart"/>
       <w:r>
         <w:rPr>
           <w:rStyle w:val="VerbatimChar"/>
@@ -6583,6 +6660,7 @@
         </w:rPr>
         <w:t>)</w:t>
       </w:r>
+      <w:proofErr w:type="gramEnd"/>
       <w:r>
         <w:rPr>
           <w:rStyle w:val="VerbatimChar"/>
@@ -6602,6 +6680,7 @@
         </w:rPr>
         <w:t xml:space="preserve">          </w:t>
       </w:r>
+      <w:proofErr w:type="gramStart"/>
       <w:r>
         <w:rPr>
           <w:rStyle w:val="VerbatimChar"/>
@@ -6623,12 +6702,14 @@
         </w:rPr>
         <w:t>)</w:t>
       </w:r>
+      <w:proofErr w:type="gramEnd"/>
       <w:r>
         <w:rPr>
           <w:rStyle w:val="VerbatimChar"/>
         </w:rPr>
         <w:t xml:space="preserve">              </w:t>
       </w:r>
+      <w:proofErr w:type="gramStart"/>
       <w:r>
         <w:rPr>
           <w:rStyle w:val="VerbatimChar"/>
@@ -6650,6 +6731,7 @@
         </w:rPr>
         <w:t>)</w:t>
       </w:r>
+      <w:proofErr w:type="gramEnd"/>
     </w:p>
     <w:p>
       <w:pPr>
@@ -6767,7 +6849,6 @@
           <w:b/>
           <w:bCs/>
         </w:rPr>
-        <w:lastRenderedPageBreak/>
         <w:t>缓冲</w:t>
       </w:r>
       <w:r>
@@ -6851,6 +6932,7 @@
       <w:bookmarkStart w:id="21" w:name="内置控件清单"/>
       <w:bookmarkEnd w:id="20"/>
       <w:r>
+        <w:lastRenderedPageBreak/>
         <w:t xml:space="preserve">5.3 </w:t>
       </w:r>
       <w:r>
@@ -6960,9 +7042,11 @@
             <w:r>
               <w:t>、</w:t>
             </w:r>
+            <w:proofErr w:type="spellStart"/>
             <w:r>
               <w:t>mysql</w:t>
             </w:r>
+            <w:proofErr w:type="spellEnd"/>
             <w:r>
               <w:t>、</w:t>
             </w:r>
@@ -6992,8 +7076,13 @@
               <w:t>、</w:t>
             </w:r>
             <w:r>
-              <w:t>Redis(scan)</w:t>
-            </w:r>
+              <w:t>Redis</w:t>
+            </w:r>
+            <w:proofErr w:type="gramStart"/>
+            <w:r>
+              <w:t>(scan)</w:t>
+            </w:r>
+            <w:proofErr w:type="gramEnd"/>
             <w:r>
               <w:t>、</w:t>
             </w:r>
@@ -7037,6 +7126,7 @@
               </w:rPr>
               <w:t>字段拼接</w:t>
             </w:r>
+            <w:proofErr w:type="gramStart"/>
             <w:r>
               <w:rPr>
                 <w:rFonts w:hint="eastAsia"/>
@@ -7055,6 +7145,7 @@
               </w:rPr>
               <w:t>C)</w:t>
             </w:r>
+            <w:proofErr w:type="gramEnd"/>
             <w:r>
               <w:rPr>
                 <w:rFonts w:hint="eastAsia"/>
@@ -7073,24 +7164,28 @@
               </w:rPr>
               <w:t>→</w:t>
             </w:r>
+            <w:proofErr w:type="spellStart"/>
             <w:r>
               <w:rPr>
                 <w:rFonts w:hint="eastAsia"/>
               </w:rPr>
               <w:t>json</w:t>
             </w:r>
+            <w:proofErr w:type="spellEnd"/>
             <w:r>
               <w:rPr>
                 <w:rFonts w:hint="eastAsia"/>
               </w:rPr>
               <w:t>、</w:t>
             </w:r>
+            <w:proofErr w:type="spellStart"/>
             <w:r>
               <w:rPr>
                 <w:rFonts w:hint="eastAsia"/>
               </w:rPr>
               <w:t>json</w:t>
             </w:r>
+            <w:proofErr w:type="spellEnd"/>
             <w:r>
               <w:rPr>
                 <w:rFonts w:hint="eastAsia"/>
@@ -7201,9 +7296,11 @@
             <w:r>
               <w:t>、</w:t>
             </w:r>
+            <w:proofErr w:type="spellStart"/>
             <w:r>
               <w:t>mysql</w:t>
             </w:r>
+            <w:proofErr w:type="spellEnd"/>
             <w:r>
               <w:t>、</w:t>
             </w:r>
@@ -7249,9 +7346,9 @@
       <w:pPr>
         <w:pStyle w:val="2"/>
       </w:pPr>
-      <w:bookmarkStart w:id="22" w:name="核心数据模型"/>
-      <w:bookmarkStart w:id="23" w:name="_Toc238503875"/>
-      <w:bookmarkEnd w:id="17"/>
+      <w:bookmarkStart w:id="22" w:name="_Toc238503875"/>
+      <w:bookmarkStart w:id="23" w:name="核心数据模型"/>
+      <w:bookmarkEnd w:id="18"/>
       <w:bookmarkEnd w:id="21"/>
       <w:r>
         <w:t xml:space="preserve">6. </w:t>
@@ -7262,7 +7359,7 @@
         </w:rPr>
         <w:t>核心数据模型</w:t>
       </w:r>
-      <w:bookmarkEnd w:id="23"/>
+      <w:bookmarkEnd w:id="22"/>
     </w:p>
     <w:p>
       <w:pPr>
@@ -7296,12 +7393,14 @@
       <w:r>
         <w:t xml:space="preserve"> </w:t>
       </w:r>
+      <w:proofErr w:type="spellStart"/>
       <w:r>
         <w:rPr>
           <w:rStyle w:val="VerbatimChar"/>
         </w:rPr>
         <w:t>job.dag_json</w:t>
       </w:r>
+      <w:proofErr w:type="spellEnd"/>
       <w:r>
         <w:rPr>
           <w:rFonts w:hint="eastAsia"/>
@@ -7407,7 +7506,21 @@
         <w:rPr>
           <w:rStyle w:val="DataTypeTok"/>
         </w:rPr>
-        <w:t>"componentCode"</w:t>
+        <w:t>"</w:t>
+      </w:r>
+      <w:proofErr w:type="spellStart"/>
+      <w:r>
+        <w:rPr>
+          <w:rStyle w:val="DataTypeTok"/>
+        </w:rPr>
+        <w:t>componentCode</w:t>
+      </w:r>
+      <w:proofErr w:type="spellEnd"/>
+      <w:r>
+        <w:rPr>
+          <w:rStyle w:val="DataTypeTok"/>
+        </w:rPr>
+        <w:t>"</w:t>
       </w:r>
       <w:r>
         <w:rPr>
@@ -7542,7 +7655,21 @@
         <w:rPr>
           <w:rStyle w:val="DataTypeTok"/>
         </w:rPr>
-        <w:t>"hasHeader"</w:t>
+        <w:t>"</w:t>
+      </w:r>
+      <w:proofErr w:type="spellStart"/>
+      <w:r>
+        <w:rPr>
+          <w:rStyle w:val="DataTypeTok"/>
+        </w:rPr>
+        <w:t>hasHeader</w:t>
+      </w:r>
+      <w:proofErr w:type="spellEnd"/>
+      <w:r>
+        <w:rPr>
+          <w:rStyle w:val="DataTypeTok"/>
+        </w:rPr>
+        <w:t>"</w:t>
       </w:r>
       <w:r>
         <w:rPr>
@@ -7629,7 +7756,21 @@
         <w:rPr>
           <w:rStyle w:val="DataTypeTok"/>
         </w:rPr>
-        <w:t>"componentCode"</w:t>
+        <w:t>"</w:t>
+      </w:r>
+      <w:proofErr w:type="spellStart"/>
+      <w:r>
+        <w:rPr>
+          <w:rStyle w:val="DataTypeTok"/>
+        </w:rPr>
+        <w:t>componentCode</w:t>
+      </w:r>
+      <w:proofErr w:type="spellEnd"/>
+      <w:r>
+        <w:rPr>
+          <w:rStyle w:val="DataTypeTok"/>
+        </w:rPr>
+        <w:t>"</w:t>
       </w:r>
       <w:r>
         <w:rPr>
@@ -7647,7 +7788,21 @@
         <w:rPr>
           <w:rStyle w:val="StringTok"/>
         </w:rPr>
-        <w:t>"field-concat"</w:t>
+        <w:t>"field-</w:t>
+      </w:r>
+      <w:proofErr w:type="spellStart"/>
+      <w:r>
+        <w:rPr>
+          <w:rStyle w:val="StringTok"/>
+        </w:rPr>
+        <w:t>concat</w:t>
+      </w:r>
+      <w:proofErr w:type="spellEnd"/>
+      <w:r>
+        <w:rPr>
+          <w:rStyle w:val="StringTok"/>
+        </w:rPr>
+        <w:t>"</w:t>
       </w:r>
       <w:r>
         <w:rPr>
@@ -7692,7 +7847,21 @@
         <w:rPr>
           <w:rStyle w:val="DataTypeTok"/>
         </w:rPr>
-        <w:t>"sourceFields"</w:t>
+        <w:t>"</w:t>
+      </w:r>
+      <w:proofErr w:type="spellStart"/>
+      <w:r>
+        <w:rPr>
+          <w:rStyle w:val="DataTypeTok"/>
+        </w:rPr>
+        <w:t>sourceFields</w:t>
+      </w:r>
+      <w:proofErr w:type="spellEnd"/>
+      <w:r>
+        <w:rPr>
+          <w:rStyle w:val="DataTypeTok"/>
+        </w:rPr>
+        <w:t>"</w:t>
       </w:r>
       <w:r>
         <w:rPr>
@@ -7758,7 +7927,21 @@
         <w:rPr>
           <w:rStyle w:val="DataTypeTok"/>
         </w:rPr>
-        <w:t>"targetField"</w:t>
+        <w:t>"</w:t>
+      </w:r>
+      <w:proofErr w:type="spellStart"/>
+      <w:r>
+        <w:rPr>
+          <w:rStyle w:val="DataTypeTok"/>
+        </w:rPr>
+        <w:t>targetField</w:t>
+      </w:r>
+      <w:proofErr w:type="spellEnd"/>
+      <w:r>
+        <w:rPr>
+          <w:rStyle w:val="DataTypeTok"/>
+        </w:rPr>
+        <w:t>"</w:t>
       </w:r>
       <w:r>
         <w:rPr>
@@ -7881,7 +8064,21 @@
         <w:rPr>
           <w:rStyle w:val="DataTypeTok"/>
         </w:rPr>
-        <w:t>"componentCode"</w:t>
+        <w:t>"</w:t>
+      </w:r>
+      <w:proofErr w:type="spellStart"/>
+      <w:r>
+        <w:rPr>
+          <w:rStyle w:val="DataTypeTok"/>
+        </w:rPr>
+        <w:t>componentCode</w:t>
+      </w:r>
+      <w:proofErr w:type="spellEnd"/>
+      <w:r>
+        <w:rPr>
+          <w:rStyle w:val="DataTypeTok"/>
+        </w:rPr>
+        <w:t>"</w:t>
       </w:r>
       <w:r>
         <w:rPr>
@@ -8270,12 +8467,14 @@
             <w:pPr>
               <w:pStyle w:val="Compact"/>
             </w:pPr>
+            <w:proofErr w:type="spellStart"/>
             <w:r>
               <w:rPr>
                 <w:rStyle w:val="VerbatimChar"/>
               </w:rPr>
               <w:t>sys_user</w:t>
             </w:r>
+            <w:proofErr w:type="spellEnd"/>
           </w:p>
         </w:tc>
         <w:tc>
@@ -8304,12 +8503,14 @@
             <w:pPr>
               <w:pStyle w:val="Compact"/>
             </w:pPr>
+            <w:proofErr w:type="spellStart"/>
             <w:r>
               <w:rPr>
                 <w:rStyle w:val="VerbatimChar"/>
               </w:rPr>
               <w:t>component_def</w:t>
             </w:r>
+            <w:proofErr w:type="spellEnd"/>
           </w:p>
         </w:tc>
         <w:tc>
@@ -8375,12 +8576,14 @@
               </w:rPr>
               <w:t>作业（名称、</w:t>
             </w:r>
+            <w:proofErr w:type="spellStart"/>
             <w:r>
               <w:rPr>
                 <w:rFonts w:hint="eastAsia"/>
               </w:rPr>
               <w:t>dag_json</w:t>
             </w:r>
+            <w:proofErr w:type="spellEnd"/>
             <w:r>
               <w:rPr>
                 <w:rFonts w:hint="eastAsia"/>
@@ -8399,12 +8602,14 @@
             <w:pPr>
               <w:pStyle w:val="Compact"/>
             </w:pPr>
+            <w:proofErr w:type="spellStart"/>
             <w:r>
               <w:rPr>
                 <w:rStyle w:val="VerbatimChar"/>
               </w:rPr>
               <w:t>job_instance</w:t>
             </w:r>
+            <w:proofErr w:type="spellEnd"/>
           </w:p>
         </w:tc>
         <w:tc>
@@ -8419,14 +8624,7 @@
               <w:rPr>
                 <w:rFonts w:hint="eastAsia"/>
               </w:rPr>
-              <w:t>作业运行实例（作业版本快照、状态、</w:t>
-            </w:r>
-            <w:r>
-              <w:rPr>
-                <w:rFonts w:hint="eastAsia"/>
-              </w:rPr>
-              <w:lastRenderedPageBreak/>
-              <w:t>分片信息、指派</w:t>
+              <w:t>作业运行实例（作业版本快照、状态、分片信息、指派</w:t>
             </w:r>
             <w:r>
               <w:t xml:space="preserve"> </w:t>
@@ -8455,13 +8653,14 @@
             <w:pPr>
               <w:pStyle w:val="Compact"/>
             </w:pPr>
+            <w:proofErr w:type="spellStart"/>
             <w:r>
               <w:rPr>
                 <w:rStyle w:val="VerbatimChar"/>
               </w:rPr>
-              <w:lastRenderedPageBreak/>
               <w:t>worker_node</w:t>
             </w:r>
+            <w:proofErr w:type="spellEnd"/>
           </w:p>
         </w:tc>
         <w:tc>
@@ -8489,11 +8688,12 @@
       <w:pPr>
         <w:pStyle w:val="2"/>
       </w:pPr>
-      <w:bookmarkStart w:id="26" w:name="横向扩展方案"/>
-      <w:bookmarkStart w:id="27" w:name="_Toc238503876"/>
-      <w:bookmarkEnd w:id="22"/>
+      <w:bookmarkStart w:id="26" w:name="_Toc238503876"/>
+      <w:bookmarkStart w:id="27" w:name="横向扩展方案"/>
+      <w:bookmarkEnd w:id="23"/>
       <w:bookmarkEnd w:id="25"/>
       <w:r>
+        <w:lastRenderedPageBreak/>
         <w:t xml:space="preserve">7. </w:t>
       </w:r>
       <w:r>
@@ -8502,7 +8702,7 @@
         </w:rPr>
         <w:t>横向扩展方案</w:t>
       </w:r>
-      <w:bookmarkEnd w:id="27"/>
+      <w:bookmarkEnd w:id="26"/>
     </w:p>
     <w:p>
       <w:pPr>
@@ -8742,7 +8942,69 @@
         <w:rPr>
           <w:rFonts w:hint="eastAsia"/>
         </w:rPr>
-        <w:t>：暂不支持并行分片（JDBC 源与 Excel 源不读取分片参数，并行度&gt;1 时每个分片会重复读全量数据，控制面已强制此类作业并行度=1）。</w:t>
+        <w:t>：暂不支持并行分片（</w:t>
+      </w:r>
+      <w:r>
+        <w:rPr>
+          <w:rFonts w:hint="eastAsia"/>
+        </w:rPr>
+        <w:t xml:space="preserve">JDBC </w:t>
+      </w:r>
+      <w:r>
+        <w:rPr>
+          <w:rFonts w:hint="eastAsia"/>
+        </w:rPr>
+        <w:t>源与</w:t>
+      </w:r>
+      <w:r>
+        <w:rPr>
+          <w:rFonts w:hint="eastAsia"/>
+        </w:rPr>
+        <w:t xml:space="preserve"> Excel </w:t>
+      </w:r>
+      <w:r>
+        <w:rPr>
+          <w:rFonts w:hint="eastAsia"/>
+        </w:rPr>
+        <w:t>源不读取分片参数，并行</w:t>
+      </w:r>
+      <w:proofErr w:type="gramStart"/>
+      <w:r>
+        <w:rPr>
+          <w:rFonts w:hint="eastAsia"/>
+        </w:rPr>
+        <w:t>度</w:t>
+      </w:r>
+      <w:r>
+        <w:rPr>
+          <w:rFonts w:hint="eastAsia"/>
+        </w:rPr>
+        <w:t>&gt;</w:t>
+      </w:r>
+      <w:proofErr w:type="gramEnd"/>
+      <w:r>
+        <w:rPr>
+          <w:rFonts w:hint="eastAsia"/>
+        </w:rPr>
+        <w:t xml:space="preserve">1 </w:t>
+      </w:r>
+      <w:r>
+        <w:rPr>
+          <w:rFonts w:hint="eastAsia"/>
+        </w:rPr>
+        <w:t>时每个分片会重复读全量数据，控制面已强制此类作业并行度</w:t>
+      </w:r>
+      <w:r>
+        <w:rPr>
+          <w:rFonts w:hint="eastAsia"/>
+        </w:rPr>
+        <w:t>=1</w:t>
+      </w:r>
+      <w:r>
+        <w:rPr>
+          <w:rFonts w:hint="eastAsia"/>
+        </w:rPr>
+        <w:t>）。</w:t>
       </w:r>
     </w:p>
     <w:p>
@@ -8818,7 +9080,21 @@
         <w:rPr>
           <w:rStyle w:val="VerbatimChar"/>
         </w:rPr>
-        <w:t>docker compose up --scale worker=1</w:t>
+        <w:t xml:space="preserve">docker compose </w:t>
+      </w:r>
+      <w:proofErr w:type="spellStart"/>
+      <w:r>
+        <w:rPr>
+          <w:rStyle w:val="VerbatimChar"/>
+        </w:rPr>
+        <w:t>up --scale</w:t>
+      </w:r>
+      <w:proofErr w:type="spellEnd"/>
+      <w:r>
+        <w:rPr>
+          <w:rStyle w:val="VerbatimChar"/>
+        </w:rPr>
+        <w:t xml:space="preserve"> worker=1</w:t>
       </w:r>
       <w:r>
         <w:t xml:space="preserve"> </w:t>
@@ -8861,9 +9137,9 @@
       <w:pPr>
         <w:pStyle w:val="2"/>
       </w:pPr>
-      <w:bookmarkStart w:id="28" w:name="性能设计针对验收场景csv拼接csv-8vc32g机械盘"/>
-      <w:bookmarkStart w:id="29" w:name="_Toc238503877"/>
-      <w:bookmarkEnd w:id="26"/>
+      <w:bookmarkStart w:id="28" w:name="_Toc238503877"/>
+      <w:bookmarkStart w:id="29" w:name="性能设计针对验收场景csv拼接csv-8vc32g机械盘"/>
+      <w:bookmarkEnd w:id="27"/>
       <w:r>
         <w:t xml:space="preserve">8. </w:t>
       </w:r>
@@ -8906,7 +9182,7 @@
         </w:rPr>
         <w:t>机械盘）</w:t>
       </w:r>
-      <w:bookmarkEnd w:id="29"/>
+      <w:bookmarkEnd w:id="28"/>
     </w:p>
     <w:p>
       <w:pPr>
@@ -9047,7 +9323,15 @@
               <w:t>读</w:t>
             </w:r>
             <w:r>
-              <w:t xml:space="preserve"> 8MB BufferedInputStream + </w:t>
+              <w:t xml:space="preserve"> 8MB </w:t>
+            </w:r>
+            <w:proofErr w:type="spellStart"/>
+            <w:r>
+              <w:t>BufferedInputStream</w:t>
+            </w:r>
+            <w:proofErr w:type="spellEnd"/>
+            <w:r>
+              <w:t xml:space="preserve"> + </w:t>
             </w:r>
             <w:r>
               <w:rPr>
@@ -9058,12 +9342,14 @@
             <w:r>
               <w:t xml:space="preserve"> 8MB </w:t>
             </w:r>
+            <w:proofErr w:type="spellStart"/>
             <w:r>
               <w:rPr>
                 <w:rFonts w:hint="eastAsia"/>
               </w:rPr>
               <w:t>BufferedOutputStream</w:t>
             </w:r>
+            <w:proofErr w:type="spellEnd"/>
             <w:r>
               <w:rPr>
                 <w:rFonts w:hint="eastAsia"/>
@@ -9146,6 +9432,7 @@
               </w:rPr>
               <w:t>max(</w:t>
             </w:r>
+            <w:proofErr w:type="gramStart"/>
             <w:r>
               <w:rPr>
                 <w:rFonts w:hint="eastAsia"/>
@@ -9158,9 +9445,11 @@
               </w:rPr>
               <w:t>,</w:t>
             </w:r>
+            <w:proofErr w:type="gramEnd"/>
             <w:r>
               <w:t xml:space="preserve"> </w:t>
             </w:r>
+            <w:proofErr w:type="gramStart"/>
             <w:r>
               <w:rPr>
                 <w:rFonts w:hint="eastAsia"/>
@@ -9173,9 +9462,11 @@
               </w:rPr>
               <w:t>,</w:t>
             </w:r>
+            <w:proofErr w:type="gramEnd"/>
             <w:r>
               <w:t xml:space="preserve"> </w:t>
             </w:r>
+            <w:proofErr w:type="gramStart"/>
             <w:r>
               <w:rPr>
                 <w:rFonts w:hint="eastAsia"/>
@@ -9192,7 +9483,14 @@
               <w:rPr>
                 <w:rFonts w:hint="eastAsia"/>
               </w:rPr>
-              <w:t>，而非三者之和</w:t>
+              <w:t>，</w:t>
+            </w:r>
+            <w:proofErr w:type="gramEnd"/>
+            <w:r>
+              <w:rPr>
+                <w:rFonts w:hint="eastAsia"/>
+              </w:rPr>
+              <w:t>而非三者之和</w:t>
             </w:r>
           </w:p>
         </w:tc>
@@ -9369,14 +9667,7 @@
               <w:rPr>
                 <w:rFonts w:hint="eastAsia"/>
               </w:rPr>
-              <w:t>（受限于机械</w:t>
-            </w:r>
-            <w:r>
-              <w:rPr>
-                <w:rFonts w:hint="eastAsia"/>
-              </w:rPr>
-              <w:lastRenderedPageBreak/>
-              <w:t>盘）</w:t>
+              <w:t>（受限于机械盘）</w:t>
             </w:r>
           </w:p>
         </w:tc>
@@ -9386,9 +9677,9 @@
       <w:pPr>
         <w:pStyle w:val="2"/>
       </w:pPr>
-      <w:bookmarkStart w:id="30" w:name="性能测试方案对应性能测试报告"/>
-      <w:bookmarkStart w:id="31" w:name="_Toc238503878"/>
-      <w:bookmarkEnd w:id="28"/>
+      <w:bookmarkStart w:id="30" w:name="_Toc238503878"/>
+      <w:bookmarkStart w:id="31" w:name="性能测试方案对应性能测试报告"/>
+      <w:bookmarkEnd w:id="29"/>
       <w:r>
         <w:lastRenderedPageBreak/>
         <w:t xml:space="preserve">9. </w:t>
@@ -9399,7 +9690,7 @@
         </w:rPr>
         <w:t>性能测试方案（对应《性能测试报告》）</w:t>
       </w:r>
-      <w:bookmarkEnd w:id="31"/>
+      <w:bookmarkEnd w:id="30"/>
     </w:p>
     <w:p>
       <w:pPr>
@@ -9738,12 +10029,14 @@
         </w:rPr>
         <w:t>（</w:t>
       </w:r>
+      <w:proofErr w:type="spellStart"/>
       <w:r>
         <w:rPr>
           <w:rStyle w:val="VerbatimChar"/>
         </w:rPr>
         <w:t>iostat</w:t>
       </w:r>
+      <w:proofErr w:type="spellEnd"/>
       <w:r>
         <w:rPr>
           <w:rFonts w:hint="eastAsia"/>
@@ -9864,9 +10157,9 @@
       <w:pPr>
         <w:pStyle w:val="2"/>
       </w:pPr>
-      <w:bookmarkStart w:id="32" w:name="实施计划"/>
-      <w:bookmarkStart w:id="33" w:name="_Toc238503879"/>
-      <w:bookmarkEnd w:id="30"/>
+      <w:bookmarkStart w:id="32" w:name="_Toc238503879"/>
+      <w:bookmarkStart w:id="33" w:name="实施计划"/>
+      <w:bookmarkEnd w:id="31"/>
       <w:r>
         <w:t xml:space="preserve">10. </w:t>
       </w:r>
@@ -9876,7 +10169,7 @@
         </w:rPr>
         <w:t>实施计划</w:t>
       </w:r>
-      <w:bookmarkEnd w:id="33"/>
+      <w:bookmarkEnd w:id="32"/>
     </w:p>
     <w:tbl>
       <w:tblPr>
@@ -10408,9 +10701,9 @@
       <w:pPr>
         <w:pStyle w:val="2"/>
       </w:pPr>
-      <w:bookmarkStart w:id="34" w:name="交付物清单映射"/>
-      <w:bookmarkStart w:id="35" w:name="_Toc238503880"/>
-      <w:bookmarkEnd w:id="32"/>
+      <w:bookmarkStart w:id="34" w:name="_Toc238503880"/>
+      <w:bookmarkStart w:id="35" w:name="交付物清单映射"/>
+      <w:bookmarkEnd w:id="33"/>
       <w:r>
         <w:t xml:space="preserve">11. </w:t>
       </w:r>
@@ -10420,7 +10713,7 @@
         </w:rPr>
         <w:t>交付物清单映射</w:t>
       </w:r>
-      <w:bookmarkEnd w:id="35"/>
+      <w:bookmarkEnd w:id="34"/>
     </w:p>
     <w:tbl>
       <w:tblPr>
@@ -10636,7 +10929,6 @@
               <w:rPr>
                 <w:rFonts w:hint="eastAsia"/>
               </w:rPr>
-              <w:lastRenderedPageBreak/>
               <w:t>性能测试报告</w:t>
             </w:r>
             <w:r>
@@ -10762,6 +11054,7 @@
               <w:rPr>
                 <w:rFonts w:hint="eastAsia"/>
               </w:rPr>
+              <w:lastRenderedPageBreak/>
               <w:t>项目源码包</w:t>
             </w:r>
             <w:r>
@@ -10789,8 +11082,8 @@
           </w:p>
         </w:tc>
       </w:tr>
-      <w:bookmarkEnd w:id="0"/>
-      <w:bookmarkEnd w:id="34"/>
+      <w:bookmarkEnd w:id="1"/>
+      <w:bookmarkEnd w:id="35"/>
     </w:tbl>
     <w:p/>
     <w:sectPr>

</xml_diff>